<commit_message>
food and everything fixed :)))))))))
</commit_message>
<xml_diff>
--- a/Database format.docx
+++ b/Database format.docx
@@ -1,6 +1,6 @@
 
 <file path=word/document.xml><?xml version="1.0" encoding="utf-8"?>
-<w:document xmlns:wpc="http://schemas.microsoft.com/office/word/2010/wordprocessingCanvas" xmlns:cx="http://schemas.microsoft.com/office/drawing/2014/chartex" xmlns:cx1="http://schemas.microsoft.com/office/drawing/2015/9/8/chartex" xmlns:cx2="http://schemas.microsoft.com/office/drawing/2015/10/21/chartex" xmlns:cx3="http://schemas.microsoft.com/office/drawing/2016/5/9/chartex" xmlns:cx4="http://schemas.microsoft.com/office/drawing/2016/5/10/chartex" xmlns:cx5="http://schemas.microsoft.com/office/drawing/2016/5/11/chartex" xmlns:cx6="http://schemas.microsoft.com/office/drawing/2016/5/12/chartex" xmlns:cx7="http://schemas.microsoft.com/office/drawing/2016/5/13/chartex" xmlns:cx8="http://schemas.microsoft.com/office/drawing/2016/5/14/chartex" xmlns:mc="http://schemas.openxmlformats.org/markup-compatibility/2006" xmlns:aink="http://schemas.microsoft.com/office/drawing/2016/ink" xmlns:am3d="http://schemas.microsoft.com/office/drawing/2017/model3d" xmlns:o="urn:schemas-microsoft-com:office:office" xmlns:oel="http://schemas.microsoft.com/office/2019/extlst" xmlns:r="http://schemas.openxmlformats.org/officeDocument/2006/relationships" xmlns:m="http://schemas.openxmlformats.org/officeDocument/2006/math" xmlns:v="urn:schemas-microsoft-com:vml" xmlns:wp14="http://schemas.microsoft.com/office/word/2010/wordprocessingDrawing" xmlns:wp="http://schemas.openxmlformats.org/drawingml/2006/wordprocessingDrawing" xmlns:w10="urn:schemas-microsoft-com:office:word" xmlns:w="http://schemas.openxmlformats.org/wordprocessingml/2006/main" xmlns:w14="http://schemas.microsoft.com/office/word/2010/wordml" xmlns:w15="http://schemas.microsoft.com/office/word/2012/wordml" xmlns:w16cex="http://schemas.microsoft.com/office/word/2018/wordml/cex" xmlns:w16cid="http://schemas.microsoft.com/office/word/2016/wordml/cid" xmlns:w16="http://schemas.microsoft.com/office/word/2018/wordml" xmlns:w16du="http://schemas.microsoft.com/office/word/2023/wordml/word16du" xmlns:w16sdtdh="http://schemas.microsoft.com/office/word/2020/wordml/sdtdatahash" xmlns:w16sdtfl="http://schemas.microsoft.com/office/word/2024/wordml/sdtformatlock" xmlns:w16se="http://schemas.microsoft.com/office/word/2015/wordml/symex" xmlns:wpg="http://schemas.microsoft.com/office/word/2010/wordprocessingGroup" xmlns:wpi="http://schemas.microsoft.com/office/word/2010/wordprocessingInk" xmlns:wne="http://schemas.microsoft.com/office/word/2006/wordml" xmlns:wps="http://schemas.microsoft.com/office/word/2010/wordprocessingShape" mc:Ignorable="w14 w15 w16se w16cid w16 w16cex w16sdtdh w16sdtfl w16du wp14">
+<w:document xmlns:wpc="http://schemas.microsoft.com/office/word/2010/wordprocessingCanvas" xmlns:cx="http://schemas.microsoft.com/office/drawing/2014/chartex" xmlns:cx1="http://schemas.microsoft.com/office/drawing/2015/9/8/chartex" xmlns:cx2="http://schemas.microsoft.com/office/drawing/2015/10/21/chartex" xmlns:cx3="http://schemas.microsoft.com/office/drawing/2016/5/9/chartex" xmlns:cx4="http://schemas.microsoft.com/office/drawing/2016/5/10/chartex" xmlns:cx5="http://schemas.microsoft.com/office/drawing/2016/5/11/chartex" xmlns:cx6="http://schemas.microsoft.com/office/drawing/2016/5/12/chartex" xmlns:cx7="http://schemas.microsoft.com/office/drawing/2016/5/13/chartex" xmlns:cx8="http://schemas.microsoft.com/office/drawing/2016/5/14/chartex" xmlns:mc="http://schemas.openxmlformats.org/markup-compatibility/2006" xmlns:aink="http://schemas.microsoft.com/office/drawing/2016/ink" xmlns:am3d="http://schemas.microsoft.com/office/drawing/2017/model3d" xmlns:o="urn:schemas-microsoft-com:office:office" xmlns:oel="http://schemas.microsoft.com/office/2019/extlst" xmlns:r="http://schemas.openxmlformats.org/officeDocument/2006/relationships" xmlns:m="http://schemas.openxmlformats.org/officeDocument/2006/math" xmlns:v="urn:schemas-microsoft-com:vml" xmlns:wp14="http://schemas.microsoft.com/office/word/2010/wordprocessingDrawing" xmlns:wp="http://schemas.openxmlformats.org/drawingml/2006/wordprocessingDrawing" xmlns:w10="urn:schemas-microsoft-com:office:word" xmlns:w="http://schemas.openxmlformats.org/wordprocessingml/2006/main" xmlns:w14="http://schemas.microsoft.com/office/word/2010/wordml" xmlns:w15="http://schemas.microsoft.com/office/word/2012/wordml" xmlns:w16cex="http://schemas.microsoft.com/office/word/2018/wordml/cex" xmlns:w16cid="http://schemas.microsoft.com/office/word/2016/wordml/cid" xmlns:w16="http://schemas.microsoft.com/office/word/2018/wordml" xmlns:w16sdtdh="http://schemas.microsoft.com/office/word/2020/wordml/sdtdatahash" xmlns:w16se="http://schemas.microsoft.com/office/word/2015/wordml/symex" xmlns:wpg="http://schemas.microsoft.com/office/word/2010/wordprocessingGroup" xmlns:wpi="http://schemas.microsoft.com/office/word/2010/wordprocessingInk" xmlns:wne="http://schemas.microsoft.com/office/word/2006/wordml" xmlns:wps="http://schemas.microsoft.com/office/word/2010/wordprocessingShape" mc:Ignorable="w14 w15 w16se w16cid w16 w16cex w16sdtdh wp14">
   <w:body>
     <w:p>
       <w:pPr>
@@ -157,15 +157,27 @@
         </w:rPr>
         <w:t xml:space="preserve">     </w:t>
       </w:r>
-      <w:r>
-        <w:rPr>
-          <w:rFonts w:ascii="Menlo" w:hAnsi="Menlo" w:cs="Menlo"/>
-          <w:color w:val="000000"/>
-          <w:kern w:val="0"/>
-          <w:sz w:val="22"/>
-          <w:szCs w:val="22"/>
-        </w:rPr>
-        <w:t xml:space="preserve">sID </w:t>
+      <w:proofErr w:type="spellStart"/>
+      <w:r>
+        <w:rPr>
+          <w:rFonts w:ascii="Menlo" w:hAnsi="Menlo" w:cs="Menlo"/>
+          <w:color w:val="000000"/>
+          <w:kern w:val="0"/>
+          <w:sz w:val="22"/>
+          <w:szCs w:val="22"/>
+        </w:rPr>
+        <w:t>sID</w:t>
+      </w:r>
+      <w:proofErr w:type="spellEnd"/>
+      <w:r>
+        <w:rPr>
+          <w:rFonts w:ascii="Menlo" w:hAnsi="Menlo" w:cs="Menlo"/>
+          <w:color w:val="000000"/>
+          <w:kern w:val="0"/>
+          <w:sz w:val="22"/>
+          <w:szCs w:val="22"/>
+        </w:rPr>
+        <w:t xml:space="preserve"> </w:t>
       </w:r>
       <w:r>
         <w:rPr>
@@ -224,7 +236,29 @@
           <w:szCs w:val="22"/>
         </w:rPr>
         <w:tab/>
-        <w:t xml:space="preserve">     student_number VARCHAR(20) UNIQUE NOT NULL,</w:t>
+        <w:t xml:space="preserve">     </w:t>
+      </w:r>
+      <w:proofErr w:type="spellStart"/>
+      <w:r>
+        <w:rPr>
+          <w:rFonts w:ascii="Menlo" w:hAnsi="Menlo" w:cs="Menlo"/>
+          <w:color w:val="000000"/>
+          <w:kern w:val="0"/>
+          <w:sz w:val="22"/>
+          <w:szCs w:val="22"/>
+        </w:rPr>
+        <w:t>student_number</w:t>
+      </w:r>
+      <w:proofErr w:type="spellEnd"/>
+      <w:r>
+        <w:rPr>
+          <w:rFonts w:ascii="Menlo" w:hAnsi="Menlo" w:cs="Menlo"/>
+          <w:color w:val="000000"/>
+          <w:kern w:val="0"/>
+          <w:sz w:val="22"/>
+          <w:szCs w:val="22"/>
+        </w:rPr>
+        <w:t xml:space="preserve"> VARCHAR(20) UNIQUE NOT NULL,</w:t>
       </w:r>
     </w:p>
     <w:p>
@@ -273,7 +307,29 @@
           <w:szCs w:val="22"/>
         </w:rPr>
         <w:tab/>
-        <w:t xml:space="preserve">     full_name VARCHAR(100) NOT NULL,</w:t>
+        <w:t xml:space="preserve">     </w:t>
+      </w:r>
+      <w:proofErr w:type="spellStart"/>
+      <w:r>
+        <w:rPr>
+          <w:rFonts w:ascii="Menlo" w:hAnsi="Menlo" w:cs="Menlo"/>
+          <w:color w:val="000000"/>
+          <w:kern w:val="0"/>
+          <w:sz w:val="22"/>
+          <w:szCs w:val="22"/>
+        </w:rPr>
+        <w:t>full_name</w:t>
+      </w:r>
+      <w:proofErr w:type="spellEnd"/>
+      <w:r>
+        <w:rPr>
+          <w:rFonts w:ascii="Menlo" w:hAnsi="Menlo" w:cs="Menlo"/>
+          <w:color w:val="000000"/>
+          <w:kern w:val="0"/>
+          <w:sz w:val="22"/>
+          <w:szCs w:val="22"/>
+        </w:rPr>
+        <w:t xml:space="preserve"> VARCHAR(100) NOT NULL,</w:t>
       </w:r>
     </w:p>
     <w:p>
@@ -619,32 +675,52 @@
       <w:pPr>
         <w:ind w:left="720" w:firstLine="720"/>
       </w:pPr>
-      <w:r>
-        <w:t>rID INTEGER PRIMARY KEY,</w:t>
+      <w:proofErr w:type="spellStart"/>
+      <w:r>
+        <w:t>rID</w:t>
+      </w:r>
+      <w:proofErr w:type="spellEnd"/>
+      <w:r>
+        <w:t xml:space="preserve"> INTEGER PRIMARY KEY,</w:t>
       </w:r>
     </w:p>
     <w:p>
       <w:pPr>
         <w:ind w:left="720" w:firstLine="720"/>
       </w:pPr>
-      <w:r>
-        <w:t>building_name VARCHAR(100) NOT NULL,</w:t>
+      <w:proofErr w:type="spellStart"/>
+      <w:r>
+        <w:t>building_name</w:t>
+      </w:r>
+      <w:proofErr w:type="spellEnd"/>
+      <w:r>
+        <w:t xml:space="preserve"> VARCHAR(100) NOT NULL,</w:t>
       </w:r>
     </w:p>
     <w:p>
       <w:pPr>
         <w:ind w:left="720" w:firstLine="720"/>
       </w:pPr>
-      <w:r>
-        <w:t>room_number VARCHAR(100) NOT NULL,</w:t>
+      <w:proofErr w:type="spellStart"/>
+      <w:r>
+        <w:t>room_number</w:t>
+      </w:r>
+      <w:proofErr w:type="spellEnd"/>
+      <w:r>
+        <w:t xml:space="preserve"> VARCHAR(100) NOT NULL,</w:t>
       </w:r>
     </w:p>
     <w:p>
       <w:pPr>
         <w:ind w:left="720" w:firstLine="720"/>
       </w:pPr>
-      <w:r>
-        <w:t>room_name VARCHAR(100) NOT NULL</w:t>
+      <w:proofErr w:type="spellStart"/>
+      <w:r>
+        <w:t>room_name</w:t>
+      </w:r>
+      <w:proofErr w:type="spellEnd"/>
+      <w:r>
+        <w:t xml:space="preserve"> VARCHAR(100) NOT NULL</w:t>
       </w:r>
     </w:p>
     <w:p>
@@ -751,7 +827,14 @@
       </w:r>
       <w:r>
         <w:tab/>
-        <w:t>cID INT PRIMARY KEY,</w:t>
+      </w:r>
+      <w:proofErr w:type="spellStart"/>
+      <w:r>
+        <w:t>cID</w:t>
+      </w:r>
+      <w:proofErr w:type="spellEnd"/>
+      <w:r>
+        <w:t xml:space="preserve"> INT PRIMARY KEY,</w:t>
       </w:r>
     </w:p>
     <w:p>
@@ -832,10 +915,14 @@
       </w:r>
       <w:r>
         <w:tab/>
-        <w:t>rID INTEGER NOT NULL,</w:t>
-      </w:r>
-      <w:r>
-        <w:t xml:space="preserve"> </w:t>
+      </w:r>
+      <w:proofErr w:type="spellStart"/>
+      <w:r>
+        <w:t>rID</w:t>
+      </w:r>
+      <w:proofErr w:type="spellEnd"/>
+      <w:r>
+        <w:t xml:space="preserve"> INTEGER NOT NULL, </w:t>
       </w:r>
       <w:r>
         <w:rPr>
@@ -866,7 +953,14 @@
       </w:r>
       <w:r>
         <w:tab/>
-        <w:t>start_time TIME NOT NULL,</w:t>
+      </w:r>
+      <w:proofErr w:type="spellStart"/>
+      <w:r>
+        <w:t>start_time</w:t>
+      </w:r>
+      <w:proofErr w:type="spellEnd"/>
+      <w:r>
+        <w:t xml:space="preserve"> TIME NOT NULL,</w:t>
       </w:r>
     </w:p>
     <w:p>
@@ -878,7 +972,14 @@
       </w:r>
       <w:r>
         <w:tab/>
-        <w:t>end_time TIME NOT NULL,</w:t>
+      </w:r>
+      <w:proofErr w:type="spellStart"/>
+      <w:r>
+        <w:t>end_time</w:t>
+      </w:r>
+      <w:proofErr w:type="spellEnd"/>
+      <w:r>
+        <w:t xml:space="preserve"> TIME NOT NULL,</w:t>
       </w:r>
     </w:p>
     <w:p/>
@@ -891,7 +992,23 @@
       </w:r>
       <w:r>
         <w:tab/>
-        <w:t>FOREIGN KEY (rID) REFERENCES rooms(rID)</w:t>
+        <w:t>FOREIGN KEY (</w:t>
+      </w:r>
+      <w:proofErr w:type="spellStart"/>
+      <w:r>
+        <w:t>rID</w:t>
+      </w:r>
+      <w:proofErr w:type="spellEnd"/>
+      <w:r>
+        <w:t>) REFERENCES rooms(</w:t>
+      </w:r>
+      <w:proofErr w:type="spellStart"/>
+      <w:r>
+        <w:t>rID</w:t>
+      </w:r>
+      <w:proofErr w:type="spellEnd"/>
+      <w:r>
+        <w:t>)</w:t>
       </w:r>
     </w:p>
     <w:p>
@@ -940,12 +1057,31 @@
     <w:p/>
     <w:p>
       <w:r>
-        <w:t>CREATE TABLE student_classes (</w:t>
-      </w:r>
-    </w:p>
-    <w:p>
-      <w:r>
-        <w:t xml:space="preserve">    sID </w:t>
+        <w:t xml:space="preserve">CREATE TABLE </w:t>
+      </w:r>
+      <w:proofErr w:type="spellStart"/>
+      <w:r>
+        <w:t>student_classes</w:t>
+      </w:r>
+      <w:proofErr w:type="spellEnd"/>
+      <w:r>
+        <w:t xml:space="preserve"> (</w:t>
+      </w:r>
+      <w:r>
+        <w:t>c</w:t>
+      </w:r>
+    </w:p>
+    <w:p>
+      <w:r>
+        <w:t xml:space="preserve">    </w:t>
+      </w:r>
+      <w:proofErr w:type="spellStart"/>
+      <w:r>
+        <w:t>sID</w:t>
+      </w:r>
+      <w:proofErr w:type="spellEnd"/>
+      <w:r>
+        <w:t xml:space="preserve"> </w:t>
       </w:r>
       <w:r>
         <w:t>INT NOT NULL,</w:t>
@@ -955,8 +1091,13 @@
       <w:r>
         <w:t xml:space="preserve">    </w:t>
       </w:r>
-      <w:r>
-        <w:t xml:space="preserve">cID </w:t>
+      <w:proofErr w:type="spellStart"/>
+      <w:r>
+        <w:t>cID</w:t>
+      </w:r>
+      <w:proofErr w:type="spellEnd"/>
+      <w:r>
+        <w:t xml:space="preserve"> </w:t>
       </w:r>
       <w:r>
         <w:t>INT NOT NULL,</w:t>
@@ -966,15 +1107,19 @@
       <w:r>
         <w:t xml:space="preserve">    PRIMARY KEY (</w:t>
       </w:r>
+      <w:proofErr w:type="spellStart"/>
       <w:r>
         <w:t>sID</w:t>
       </w:r>
+      <w:proofErr w:type="spellEnd"/>
       <w:r>
         <w:t xml:space="preserve">, </w:t>
       </w:r>
+      <w:proofErr w:type="spellStart"/>
       <w:r>
         <w:t>cID</w:t>
       </w:r>
+      <w:proofErr w:type="spellEnd"/>
       <w:r>
         <w:t>),</w:t>
       </w:r>
@@ -983,35 +1128,136 @@
       <w:r>
         <w:t xml:space="preserve">    FOREIGN KEY (</w:t>
       </w:r>
+      <w:proofErr w:type="spellStart"/>
       <w:r>
         <w:t>sID</w:t>
       </w:r>
+      <w:proofErr w:type="spellEnd"/>
       <w:r>
         <w:t>) REFERENCES students(</w:t>
       </w:r>
+      <w:proofErr w:type="spellStart"/>
       <w:r>
         <w:t>sID</w:t>
       </w:r>
+      <w:proofErr w:type="spellEnd"/>
       <w:r>
         <w:t>),</w:t>
       </w:r>
     </w:p>
     <w:p>
       <w:r>
+        <w:t xml:space="preserve">    FOREIGN KEY (</w:t>
+      </w:r>
+      <w:proofErr w:type="spellStart"/>
+      <w:r>
+        <w:t>cID</w:t>
+      </w:r>
+      <w:proofErr w:type="spellEnd"/>
+      <w:r>
+        <w:t>) REFERENCES classes(</w:t>
+      </w:r>
+      <w:proofErr w:type="spellStart"/>
+      <w:r>
+        <w:t>cID</w:t>
+      </w:r>
+      <w:proofErr w:type="spellEnd"/>
+      <w:r>
+        <w:t>)</w:t>
+      </w:r>
+    </w:p>
+    <w:p>
+      <w:r>
         <w:lastRenderedPageBreak/>
-        <w:t xml:space="preserve">    FOREIGN KEY (</w:t>
-      </w:r>
-      <w:r>
-        <w:t>cID</w:t>
-      </w:r>
-      <w:r>
-        <w:t>) REFERENCES classes(</w:t>
-      </w:r>
-      <w:r>
-        <w:t>cID</w:t>
-      </w:r>
-      <w:r>
-        <w:t>)</w:t>
+        <w:t>);</w:t>
+      </w:r>
+    </w:p>
+    <w:p/>
+    <w:p>
+      <w:pPr>
+        <w:pStyle w:val="ListParagraph"/>
+        <w:numPr>
+          <w:ilvl w:val="0"/>
+          <w:numId w:val="1"/>
+        </w:numPr>
+      </w:pPr>
+      <w:r>
+        <w:t>Food</w:t>
+      </w:r>
+    </w:p>
+    <w:p>
+      <w:r>
+        <w:t xml:space="preserve">CREATE TABLE </w:t>
+      </w:r>
+      <w:proofErr w:type="spellStart"/>
+      <w:r>
+        <w:t>food_spots</w:t>
+      </w:r>
+      <w:proofErr w:type="spellEnd"/>
+      <w:r>
+        <w:t xml:space="preserve"> (</w:t>
+      </w:r>
+    </w:p>
+    <w:p>
+      <w:r>
+        <w:t xml:space="preserve">    </w:t>
+      </w:r>
+      <w:proofErr w:type="spellStart"/>
+      <w:r>
+        <w:t>rID</w:t>
+      </w:r>
+      <w:proofErr w:type="spellEnd"/>
+      <w:r>
+        <w:t xml:space="preserve"> INTEGER PRIMARY KEY,</w:t>
+      </w:r>
+    </w:p>
+    <w:p>
+      <w:r>
+        <w:t xml:space="preserve">    name TEXT NOT NULL,</w:t>
+      </w:r>
+    </w:p>
+    <w:p>
+      <w:r>
+        <w:t xml:space="preserve">    day TEXT,</w:t>
+      </w:r>
+    </w:p>
+    <w:p>
+      <w:r>
+        <w:t xml:space="preserve">    </w:t>
+      </w:r>
+      <w:proofErr w:type="spellStart"/>
+      <w:r>
+        <w:t>start_time</w:t>
+      </w:r>
+      <w:proofErr w:type="spellEnd"/>
+      <w:r>
+        <w:t xml:space="preserve"> TEXT,</w:t>
+      </w:r>
+    </w:p>
+    <w:p>
+      <w:r>
+        <w:t xml:space="preserve">    </w:t>
+      </w:r>
+      <w:proofErr w:type="spellStart"/>
+      <w:r>
+        <w:t>end_time</w:t>
+      </w:r>
+      <w:proofErr w:type="spellEnd"/>
+      <w:r>
+        <w:t xml:space="preserve"> TEXT,</w:t>
+      </w:r>
+    </w:p>
+    <w:p>
+      <w:r>
+        <w:t xml:space="preserve">    </w:t>
+      </w:r>
+      <w:proofErr w:type="spellStart"/>
+      <w:r>
+        <w:t>price_range</w:t>
+      </w:r>
+      <w:proofErr w:type="spellEnd"/>
+      <w:r>
+        <w:t xml:space="preserve"> TEXT</w:t>
       </w:r>
     </w:p>
     <w:p>
@@ -1055,7 +1301,7 @@
 </file>
 
 <file path=word/endnotes.xml><?xml version="1.0" encoding="utf-8"?>
-<w:endnotes xmlns:wpc="http://schemas.microsoft.com/office/word/2010/wordprocessingCanvas" xmlns:cx="http://schemas.microsoft.com/office/drawing/2014/chartex" xmlns:cx1="http://schemas.microsoft.com/office/drawing/2015/9/8/chartex" xmlns:cx2="http://schemas.microsoft.com/office/drawing/2015/10/21/chartex" xmlns:cx3="http://schemas.microsoft.com/office/drawing/2016/5/9/chartex" xmlns:cx4="http://schemas.microsoft.com/office/drawing/2016/5/10/chartex" xmlns:cx5="http://schemas.microsoft.com/office/drawing/2016/5/11/chartex" xmlns:cx6="http://schemas.microsoft.com/office/drawing/2016/5/12/chartex" xmlns:cx7="http://schemas.microsoft.com/office/drawing/2016/5/13/chartex" xmlns:cx8="http://schemas.microsoft.com/office/drawing/2016/5/14/chartex" xmlns:mc="http://schemas.openxmlformats.org/markup-compatibility/2006" xmlns:aink="http://schemas.microsoft.com/office/drawing/2016/ink" xmlns:am3d="http://schemas.microsoft.com/office/drawing/2017/model3d" xmlns:o="urn:schemas-microsoft-com:office:office" xmlns:oel="http://schemas.microsoft.com/office/2019/extlst" xmlns:r="http://schemas.openxmlformats.org/officeDocument/2006/relationships" xmlns:m="http://schemas.openxmlformats.org/officeDocument/2006/math" xmlns:v="urn:schemas-microsoft-com:vml" xmlns:wp14="http://schemas.microsoft.com/office/word/2010/wordprocessingDrawing" xmlns:wp="http://schemas.openxmlformats.org/drawingml/2006/wordprocessingDrawing" xmlns:w10="urn:schemas-microsoft-com:office:word" xmlns:w="http://schemas.openxmlformats.org/wordprocessingml/2006/main" xmlns:w14="http://schemas.microsoft.com/office/word/2010/wordml" xmlns:w15="http://schemas.microsoft.com/office/word/2012/wordml" xmlns:w16cex="http://schemas.microsoft.com/office/word/2018/wordml/cex" xmlns:w16cid="http://schemas.microsoft.com/office/word/2016/wordml/cid" xmlns:w16="http://schemas.microsoft.com/office/word/2018/wordml" xmlns:w16du="http://schemas.microsoft.com/office/word/2023/wordml/word16du" xmlns:w16sdtdh="http://schemas.microsoft.com/office/word/2020/wordml/sdtdatahash" xmlns:w16sdtfl="http://schemas.microsoft.com/office/word/2024/wordml/sdtformatlock" xmlns:w16se="http://schemas.microsoft.com/office/word/2015/wordml/symex" xmlns:wpg="http://schemas.microsoft.com/office/word/2010/wordprocessingGroup" xmlns:wpi="http://schemas.microsoft.com/office/word/2010/wordprocessingInk" xmlns:wne="http://schemas.microsoft.com/office/word/2006/wordml" xmlns:wps="http://schemas.microsoft.com/office/word/2010/wordprocessingShape" mc:Ignorable="w14 w15 w16se w16cid w16 w16cex w16sdtdh w16sdtfl w16du wp14">
+<w:endnotes xmlns:wpc="http://schemas.microsoft.com/office/word/2010/wordprocessingCanvas" xmlns:cx="http://schemas.microsoft.com/office/drawing/2014/chartex" xmlns:cx1="http://schemas.microsoft.com/office/drawing/2015/9/8/chartex" xmlns:cx2="http://schemas.microsoft.com/office/drawing/2015/10/21/chartex" xmlns:cx3="http://schemas.microsoft.com/office/drawing/2016/5/9/chartex" xmlns:cx4="http://schemas.microsoft.com/office/drawing/2016/5/10/chartex" xmlns:cx5="http://schemas.microsoft.com/office/drawing/2016/5/11/chartex" xmlns:cx6="http://schemas.microsoft.com/office/drawing/2016/5/12/chartex" xmlns:cx7="http://schemas.microsoft.com/office/drawing/2016/5/13/chartex" xmlns:cx8="http://schemas.microsoft.com/office/drawing/2016/5/14/chartex" xmlns:mc="http://schemas.openxmlformats.org/markup-compatibility/2006" xmlns:aink="http://schemas.microsoft.com/office/drawing/2016/ink" xmlns:am3d="http://schemas.microsoft.com/office/drawing/2017/model3d" xmlns:o="urn:schemas-microsoft-com:office:office" xmlns:oel="http://schemas.microsoft.com/office/2019/extlst" xmlns:r="http://schemas.openxmlformats.org/officeDocument/2006/relationships" xmlns:m="http://schemas.openxmlformats.org/officeDocument/2006/math" xmlns:v="urn:schemas-microsoft-com:vml" xmlns:wp14="http://schemas.microsoft.com/office/word/2010/wordprocessingDrawing" xmlns:wp="http://schemas.openxmlformats.org/drawingml/2006/wordprocessingDrawing" xmlns:w10="urn:schemas-microsoft-com:office:word" xmlns:w="http://schemas.openxmlformats.org/wordprocessingml/2006/main" xmlns:w14="http://schemas.microsoft.com/office/word/2010/wordml" xmlns:w15="http://schemas.microsoft.com/office/word/2012/wordml" xmlns:w16cex="http://schemas.microsoft.com/office/word/2018/wordml/cex" xmlns:w16cid="http://schemas.microsoft.com/office/word/2016/wordml/cid" xmlns:w16="http://schemas.microsoft.com/office/word/2018/wordml" xmlns:w16sdtdh="http://schemas.microsoft.com/office/word/2020/wordml/sdtdatahash" xmlns:w16se="http://schemas.microsoft.com/office/word/2015/wordml/symex" xmlns:wpg="http://schemas.microsoft.com/office/word/2010/wordprocessingGroup" xmlns:wpi="http://schemas.microsoft.com/office/word/2010/wordprocessingInk" xmlns:wne="http://schemas.microsoft.com/office/word/2006/wordml" xmlns:wps="http://schemas.microsoft.com/office/word/2010/wordprocessingShape" mc:Ignorable="w14 w15 w16se w16cid w16 w16cex w16sdtdh wp14">
   <w:endnote w:type="separator" w:id="-1">
     <w:p>
       <w:r>
@@ -1074,7 +1320,7 @@
 </file>
 
 <file path=word/footnotes.xml><?xml version="1.0" encoding="utf-8"?>
-<w:footnotes xmlns:wpc="http://schemas.microsoft.com/office/word/2010/wordprocessingCanvas" xmlns:cx="http://schemas.microsoft.com/office/drawing/2014/chartex" xmlns:cx1="http://schemas.microsoft.com/office/drawing/2015/9/8/chartex" xmlns:cx2="http://schemas.microsoft.com/office/drawing/2015/10/21/chartex" xmlns:cx3="http://schemas.microsoft.com/office/drawing/2016/5/9/chartex" xmlns:cx4="http://schemas.microsoft.com/office/drawing/2016/5/10/chartex" xmlns:cx5="http://schemas.microsoft.com/office/drawing/2016/5/11/chartex" xmlns:cx6="http://schemas.microsoft.com/office/drawing/2016/5/12/chartex" xmlns:cx7="http://schemas.microsoft.com/office/drawing/2016/5/13/chartex" xmlns:cx8="http://schemas.microsoft.com/office/drawing/2016/5/14/chartex" xmlns:mc="http://schemas.openxmlformats.org/markup-compatibility/2006" xmlns:aink="http://schemas.microsoft.com/office/drawing/2016/ink" xmlns:am3d="http://schemas.microsoft.com/office/drawing/2017/model3d" xmlns:o="urn:schemas-microsoft-com:office:office" xmlns:oel="http://schemas.microsoft.com/office/2019/extlst" xmlns:r="http://schemas.openxmlformats.org/officeDocument/2006/relationships" xmlns:m="http://schemas.openxmlformats.org/officeDocument/2006/math" xmlns:v="urn:schemas-microsoft-com:vml" xmlns:wp14="http://schemas.microsoft.com/office/word/2010/wordprocessingDrawing" xmlns:wp="http://schemas.openxmlformats.org/drawingml/2006/wordprocessingDrawing" xmlns:w10="urn:schemas-microsoft-com:office:word" xmlns:w="http://schemas.openxmlformats.org/wordprocessingml/2006/main" xmlns:w14="http://schemas.microsoft.com/office/word/2010/wordml" xmlns:w15="http://schemas.microsoft.com/office/word/2012/wordml" xmlns:w16cex="http://schemas.microsoft.com/office/word/2018/wordml/cex" xmlns:w16cid="http://schemas.microsoft.com/office/word/2016/wordml/cid" xmlns:w16="http://schemas.microsoft.com/office/word/2018/wordml" xmlns:w16du="http://schemas.microsoft.com/office/word/2023/wordml/word16du" xmlns:w16sdtdh="http://schemas.microsoft.com/office/word/2020/wordml/sdtdatahash" xmlns:w16sdtfl="http://schemas.microsoft.com/office/word/2024/wordml/sdtformatlock" xmlns:w16se="http://schemas.microsoft.com/office/word/2015/wordml/symex" xmlns:wpg="http://schemas.microsoft.com/office/word/2010/wordprocessingGroup" xmlns:wpi="http://schemas.microsoft.com/office/word/2010/wordprocessingInk" xmlns:wne="http://schemas.microsoft.com/office/word/2006/wordml" xmlns:wps="http://schemas.microsoft.com/office/word/2010/wordprocessingShape" mc:Ignorable="w14 w15 w16se w16cid w16 w16cex w16sdtdh w16sdtfl w16du wp14">
+<w:footnotes xmlns:wpc="http://schemas.microsoft.com/office/word/2010/wordprocessingCanvas" xmlns:cx="http://schemas.microsoft.com/office/drawing/2014/chartex" xmlns:cx1="http://schemas.microsoft.com/office/drawing/2015/9/8/chartex" xmlns:cx2="http://schemas.microsoft.com/office/drawing/2015/10/21/chartex" xmlns:cx3="http://schemas.microsoft.com/office/drawing/2016/5/9/chartex" xmlns:cx4="http://schemas.microsoft.com/office/drawing/2016/5/10/chartex" xmlns:cx5="http://schemas.microsoft.com/office/drawing/2016/5/11/chartex" xmlns:cx6="http://schemas.microsoft.com/office/drawing/2016/5/12/chartex" xmlns:cx7="http://schemas.microsoft.com/office/drawing/2016/5/13/chartex" xmlns:cx8="http://schemas.microsoft.com/office/drawing/2016/5/14/chartex" xmlns:mc="http://schemas.openxmlformats.org/markup-compatibility/2006" xmlns:aink="http://schemas.microsoft.com/office/drawing/2016/ink" xmlns:am3d="http://schemas.microsoft.com/office/drawing/2017/model3d" xmlns:o="urn:schemas-microsoft-com:office:office" xmlns:oel="http://schemas.microsoft.com/office/2019/extlst" xmlns:r="http://schemas.openxmlformats.org/officeDocument/2006/relationships" xmlns:m="http://schemas.openxmlformats.org/officeDocument/2006/math" xmlns:v="urn:schemas-microsoft-com:vml" xmlns:wp14="http://schemas.microsoft.com/office/word/2010/wordprocessingDrawing" xmlns:wp="http://schemas.openxmlformats.org/drawingml/2006/wordprocessingDrawing" xmlns:w10="urn:schemas-microsoft-com:office:word" xmlns:w="http://schemas.openxmlformats.org/wordprocessingml/2006/main" xmlns:w14="http://schemas.microsoft.com/office/word/2010/wordml" xmlns:w15="http://schemas.microsoft.com/office/word/2012/wordml" xmlns:w16cex="http://schemas.microsoft.com/office/word/2018/wordml/cex" xmlns:w16cid="http://schemas.microsoft.com/office/word/2016/wordml/cid" xmlns:w16="http://schemas.microsoft.com/office/word/2018/wordml" xmlns:w16sdtdh="http://schemas.microsoft.com/office/word/2020/wordml/sdtdatahash" xmlns:w16se="http://schemas.microsoft.com/office/word/2015/wordml/symex" xmlns:wpg="http://schemas.microsoft.com/office/word/2010/wordprocessingGroup" xmlns:wpi="http://schemas.microsoft.com/office/word/2010/wordprocessingInk" xmlns:wne="http://schemas.microsoft.com/office/word/2006/wordml" xmlns:wps="http://schemas.microsoft.com/office/word/2010/wordprocessingShape" mc:Ignorable="w14 w15 w16se w16cid w16 w16cex w16sdtdh wp14">
   <w:footnote w:type="separator" w:id="-1">
     <w:p>
       <w:r>
@@ -1093,7 +1339,7 @@
 </file>
 
 <file path=word/numbering.xml><?xml version="1.0" encoding="utf-8"?>
-<w:numbering xmlns:wpc="http://schemas.microsoft.com/office/word/2010/wordprocessingCanvas" xmlns:cx="http://schemas.microsoft.com/office/drawing/2014/chartex" xmlns:cx1="http://schemas.microsoft.com/office/drawing/2015/9/8/chartex" xmlns:cx2="http://schemas.microsoft.com/office/drawing/2015/10/21/chartex" xmlns:cx3="http://schemas.microsoft.com/office/drawing/2016/5/9/chartex" xmlns:cx4="http://schemas.microsoft.com/office/drawing/2016/5/10/chartex" xmlns:cx5="http://schemas.microsoft.com/office/drawing/2016/5/11/chartex" xmlns:cx6="http://schemas.microsoft.com/office/drawing/2016/5/12/chartex" xmlns:cx7="http://schemas.microsoft.com/office/drawing/2016/5/13/chartex" xmlns:cx8="http://schemas.microsoft.com/office/drawing/2016/5/14/chartex" xmlns:mc="http://schemas.openxmlformats.org/markup-compatibility/2006" xmlns:aink="http://schemas.microsoft.com/office/drawing/2016/ink" xmlns:am3d="http://schemas.microsoft.com/office/drawing/2017/model3d" xmlns:o="urn:schemas-microsoft-com:office:office" xmlns:oel="http://schemas.microsoft.com/office/2019/extlst" xmlns:r="http://schemas.openxmlformats.org/officeDocument/2006/relationships" xmlns:m="http://schemas.openxmlformats.org/officeDocument/2006/math" xmlns:v="urn:schemas-microsoft-com:vml" xmlns:wp14="http://schemas.microsoft.com/office/word/2010/wordprocessingDrawing" xmlns:wp="http://schemas.openxmlformats.org/drawingml/2006/wordprocessingDrawing" xmlns:w10="urn:schemas-microsoft-com:office:word" xmlns:w="http://schemas.openxmlformats.org/wordprocessingml/2006/main" xmlns:w14="http://schemas.microsoft.com/office/word/2010/wordml" xmlns:w15="http://schemas.microsoft.com/office/word/2012/wordml" xmlns:w16cex="http://schemas.microsoft.com/office/word/2018/wordml/cex" xmlns:w16cid="http://schemas.microsoft.com/office/word/2016/wordml/cid" xmlns:w16="http://schemas.microsoft.com/office/word/2018/wordml" xmlns:w16du="http://schemas.microsoft.com/office/word/2023/wordml/word16du" xmlns:w16sdtdh="http://schemas.microsoft.com/office/word/2020/wordml/sdtdatahash" xmlns:w16sdtfl="http://schemas.microsoft.com/office/word/2024/wordml/sdtformatlock" xmlns:w16se="http://schemas.microsoft.com/office/word/2015/wordml/symex" xmlns:wpg="http://schemas.microsoft.com/office/word/2010/wordprocessingGroup" xmlns:wpi="http://schemas.microsoft.com/office/word/2010/wordprocessingInk" xmlns:wne="http://schemas.microsoft.com/office/word/2006/wordml" xmlns:wps="http://schemas.microsoft.com/office/word/2010/wordprocessingShape" mc:Ignorable="w14 w15 w16se w16cid w16 w16cex w16sdtdh w16sdtfl w16du wp14">
+<w:numbering xmlns:wpc="http://schemas.microsoft.com/office/word/2010/wordprocessingCanvas" xmlns:cx="http://schemas.microsoft.com/office/drawing/2014/chartex" xmlns:cx1="http://schemas.microsoft.com/office/drawing/2015/9/8/chartex" xmlns:cx2="http://schemas.microsoft.com/office/drawing/2015/10/21/chartex" xmlns:cx3="http://schemas.microsoft.com/office/drawing/2016/5/9/chartex" xmlns:cx4="http://schemas.microsoft.com/office/drawing/2016/5/10/chartex" xmlns:cx5="http://schemas.microsoft.com/office/drawing/2016/5/11/chartex" xmlns:cx6="http://schemas.microsoft.com/office/drawing/2016/5/12/chartex" xmlns:cx7="http://schemas.microsoft.com/office/drawing/2016/5/13/chartex" xmlns:cx8="http://schemas.microsoft.com/office/drawing/2016/5/14/chartex" xmlns:mc="http://schemas.openxmlformats.org/markup-compatibility/2006" xmlns:aink="http://schemas.microsoft.com/office/drawing/2016/ink" xmlns:am3d="http://schemas.microsoft.com/office/drawing/2017/model3d" xmlns:o="urn:schemas-microsoft-com:office:office" xmlns:oel="http://schemas.microsoft.com/office/2019/extlst" xmlns:r="http://schemas.openxmlformats.org/officeDocument/2006/relationships" xmlns:m="http://schemas.openxmlformats.org/officeDocument/2006/math" xmlns:v="urn:schemas-microsoft-com:vml" xmlns:wp14="http://schemas.microsoft.com/office/word/2010/wordprocessingDrawing" xmlns:wp="http://schemas.openxmlformats.org/drawingml/2006/wordprocessingDrawing" xmlns:w10="urn:schemas-microsoft-com:office:word" xmlns:w="http://schemas.openxmlformats.org/wordprocessingml/2006/main" xmlns:w14="http://schemas.microsoft.com/office/word/2010/wordml" xmlns:w15="http://schemas.microsoft.com/office/word/2012/wordml" xmlns:w16cex="http://schemas.microsoft.com/office/word/2018/wordml/cex" xmlns:w16cid="http://schemas.microsoft.com/office/word/2016/wordml/cid" xmlns:w16="http://schemas.microsoft.com/office/word/2018/wordml" xmlns:w16sdtdh="http://schemas.microsoft.com/office/word/2020/wordml/sdtdatahash" xmlns:w16se="http://schemas.microsoft.com/office/word/2015/wordml/symex" xmlns:wpg="http://schemas.microsoft.com/office/word/2010/wordprocessingGroup" xmlns:wpi="http://schemas.microsoft.com/office/word/2010/wordprocessingInk" xmlns:wne="http://schemas.microsoft.com/office/word/2006/wordml" xmlns:wps="http://schemas.microsoft.com/office/word/2010/wordprocessingShape" mc:Ignorable="w14 w15 w16se w16cid w16 w16cex w16sdtdh wp14">
   <w:abstractNum w:abstractNumId="0" w15:restartNumberingAfterBreak="0">
     <w:nsid w:val="12102EB7"/>
     <w:multiLevelType w:val="hybridMultilevel"/>
@@ -1466,7 +1712,7 @@
 </file>
 
 <file path=word/styles.xml><?xml version="1.0" encoding="utf-8"?>
-<w:styles xmlns:mc="http://schemas.openxmlformats.org/markup-compatibility/2006" xmlns:r="http://schemas.openxmlformats.org/officeDocument/2006/relationships" xmlns:w="http://schemas.openxmlformats.org/wordprocessingml/2006/main" xmlns:w14="http://schemas.microsoft.com/office/word/2010/wordml" xmlns:w15="http://schemas.microsoft.com/office/word/2012/wordml" xmlns:w16cex="http://schemas.microsoft.com/office/word/2018/wordml/cex" xmlns:w16cid="http://schemas.microsoft.com/office/word/2016/wordml/cid" xmlns:w16="http://schemas.microsoft.com/office/word/2018/wordml" xmlns:w16du="http://schemas.microsoft.com/office/word/2023/wordml/word16du" xmlns:w16sdtdh="http://schemas.microsoft.com/office/word/2020/wordml/sdtdatahash" xmlns:w16sdtfl="http://schemas.microsoft.com/office/word/2024/wordml/sdtformatlock" xmlns:w16se="http://schemas.microsoft.com/office/word/2015/wordml/symex" mc:Ignorable="w14 w15 w16se w16cid w16 w16cex w16sdtdh w16sdtfl w16du">
+<w:styles xmlns:mc="http://schemas.openxmlformats.org/markup-compatibility/2006" xmlns:r="http://schemas.openxmlformats.org/officeDocument/2006/relationships" xmlns:w="http://schemas.openxmlformats.org/wordprocessingml/2006/main" xmlns:w14="http://schemas.microsoft.com/office/word/2010/wordml" xmlns:w15="http://schemas.microsoft.com/office/word/2012/wordml" xmlns:w16cex="http://schemas.microsoft.com/office/word/2018/wordml/cex" xmlns:w16cid="http://schemas.microsoft.com/office/word/2016/wordml/cid" xmlns:w16="http://schemas.microsoft.com/office/word/2018/wordml" xmlns:w16sdtdh="http://schemas.microsoft.com/office/word/2020/wordml/sdtdatahash" xmlns:w16se="http://schemas.microsoft.com/office/word/2015/wordml/symex" mc:Ignorable="w14 w15 w16se w16cid w16 w16cex w16sdtdh">
   <w:docDefaults>
     <w:rPrDefault>
       <w:rPr>

</xml_diff>